<commit_message>
Refine editorial pacing, atmosphere, and resume content.
Narrow reading measure, ambient dust/light, softer leaf pile and shadows,
Pause states rewrite, smaller greeting, resume trims (SLA/billing/onboarding).

Co-authored-by: Cursor <cursoragent@cursor.com>
</commit_message>
<xml_diff>
--- a/Arun-S-R-Resume.docx
+++ b/Arun-S-R-Resume.docx
@@ -139,33 +139,7 @@
         <w:spacing w:before="0" w:after="40" w:line="240" w:lineRule="auto"/>
       </w:pPr>
       <w:r>
-        <w:rPr>
-          <w:rFonts w:ascii="Garamond" w:hAnsi="Garamond" w:eastAsia="Garamond"/>
-          <w:b w:val="0"/>
-          <w:i w:val="0"/>
-          <w:sz w:val="20"/>
-        </w:rPr>
-        <w:t xml:space="preserve">Frontend Developer with full-stack exposure at </w:t>
-      </w:r>
-      <w:hyperlink r:id="rId16">
-        <w:r>
-          <w:rPr>
-            <w:rFonts w:ascii="Garamond" w:hAnsi="Garamond" w:eastAsia="Garamond"/>
-            <w:sz w:val="20"/>
-            <w:color w:val="0563C1"/>
-            <w:u w:val="single"/>
-          </w:rPr>
-          <w:t>SparrowDesk</w:t>
-        </w:r>
-      </w:hyperlink>
-      <w:r>
-        <w:rPr>
-          <w:rFonts w:ascii="Garamond" w:hAnsi="Garamond" w:eastAsia="Garamond"/>
-          <w:b w:val="0"/>
-          <w:i w:val="0"/>
-          <w:sz w:val="20"/>
-        </w:rPr>
-        <w:t>, building product modules, integrations, reusable UI systems, onboarding flows, and AI-assisted support experiences. Led the development and release of the SparrowDesk Gmail Add-on on the Google Workspace Marketplace.</w:t>
+        <w:t>Frontend Developer with full-stack exposure at SparrowDesk, building product modules, integrations, reusable UI systems, and AI-assisted support experiences. Led the development and release of the SparrowDesk Gmail Add-on on the Google Workspace Marketplace.</w:t>
       </w:r>
     </w:p>
     <w:p>
@@ -258,33 +232,7 @@
         <w:ind w:left="259" w:hanging="259"/>
       </w:pPr>
       <w:r>
-        <w:rPr>
-          <w:rFonts w:ascii="Garamond" w:hAnsi="Garamond" w:eastAsia="Garamond"/>
-          <w:b w:val="0"/>
-          <w:i w:val="0"/>
-          <w:sz w:val="20"/>
-        </w:rPr>
-        <w:t xml:space="preserve">Core contributor to </w:t>
-      </w:r>
-      <w:hyperlink r:id="rId16">
-        <w:r>
-          <w:rPr>
-            <w:rFonts w:ascii="Garamond" w:hAnsi="Garamond" w:eastAsia="Garamond"/>
-            <w:sz w:val="20"/>
-            <w:color w:val="0563C1"/>
-            <w:u w:val="single"/>
-          </w:rPr>
-          <w:t>SparrowDesk</w:t>
-        </w:r>
-      </w:hyperlink>
-      <w:r>
-        <w:rPr>
-          <w:rFonts w:ascii="Garamond" w:hAnsi="Garamond" w:eastAsia="Garamond"/>
-          <w:b w:val="0"/>
-          <w:i w:val="0"/>
-          <w:sz w:val="20"/>
-        </w:rPr>
-        <w:t>, shipping frontend and backend improvements for a scalable customer support platform.</w:t>
+        <w:t>Core contributor to SparrowDesk, shipping frontend and backend modules for a scalable customer support platform.</w:t>
       </w:r>
     </w:p>
     <w:p>
@@ -321,22 +269,6 @@
           <w:sz w:val="20"/>
         </w:rPr>
         <w:t>, published on the Google Workspace Marketplace.</w:t>
-      </w:r>
-    </w:p>
-    <w:p>
-      <w:pPr>
-        <w:pStyle w:val="ListBullet"/>
-        <w:spacing w:before="0" w:after="20" w:line="240" w:lineRule="auto"/>
-        <w:ind w:left="259" w:hanging="259"/>
-      </w:pPr>
-      <w:r>
-        <w:rPr>
-          <w:rFonts w:ascii="Garamond" w:hAnsi="Garamond" w:eastAsia="Garamond"/>
-          <w:b w:val="0"/>
-          <w:i w:val="0"/>
-          <w:sz w:val="20"/>
-        </w:rPr>
-        <w:t>Owned key product areas including Billing and SLA management, taking features from implementation through polish and release readiness.</w:t>
       </w:r>
     </w:p>
     <w:p>
@@ -441,22 +373,6 @@
         <w:t>Partnered with the AI team to deliver intelligent filters and knowledge gap workflows, turning AI capabilities into usable product experiences.</w:t>
       </w:r>
     </w:p>
-    <w:p>
-      <w:pPr>
-        <w:pStyle w:val="ListBullet"/>
-        <w:spacing w:before="0" w:after="20" w:line="240" w:lineRule="auto"/>
-        <w:ind w:left="259" w:hanging="259"/>
-      </w:pPr>
-      <w:r>
-        <w:rPr>
-          <w:rFonts w:ascii="Garamond" w:hAnsi="Garamond" w:eastAsia="Garamond"/>
-          <w:b w:val="0"/>
-          <w:i w:val="0"/>
-          <w:sz w:val="20"/>
-        </w:rPr>
-        <w:t>Improved product onboarding flows to guide setup, reduce early friction, and support faster user activation.</w:t>
-      </w:r>
-    </w:p>
     <w:tbl>
       <w:tblPr>
         <w:tblW w:type="auto" w:w="0"/>
@@ -530,33 +446,7 @@
         <w:ind w:left="259" w:hanging="259"/>
       </w:pPr>
       <w:r>
-        <w:rPr>
-          <w:rFonts w:ascii="Garamond" w:hAnsi="Garamond" w:eastAsia="Garamond"/>
-          <w:b w:val="0"/>
-          <w:i w:val="0"/>
-          <w:sz w:val="20"/>
-        </w:rPr>
-        <w:t xml:space="preserve">Delivered production UI work across SLA management, macros, billing, reusable filters, and nested dropdowns using React, JavaScript, and </w:t>
-      </w:r>
-      <w:hyperlink r:id="rId17">
-        <w:r>
-          <w:rPr>
-            <w:rFonts w:ascii="Garamond" w:hAnsi="Garamond" w:eastAsia="Garamond"/>
-            <w:sz w:val="20"/>
-            <w:color w:val="0563C1"/>
-            <w:u w:val="single"/>
-          </w:rPr>
-          <w:t>Twigs</w:t>
-        </w:r>
-      </w:hyperlink>
-      <w:r>
-        <w:rPr>
-          <w:rFonts w:ascii="Garamond" w:hAnsi="Garamond" w:eastAsia="Garamond"/>
-          <w:b w:val="0"/>
-          <w:i w:val="0"/>
-          <w:sz w:val="20"/>
-        </w:rPr>
-        <w:t>.</w:t>
+        <w:t>Delivered production UI work across macros, reusable filters, and nested dropdowns using React, JavaScript, and Twigs.</w:t>
       </w:r>
     </w:p>
     <w:p>

</xml_diff>